<commit_message>
them file bao cao
</commit_message>
<xml_diff>
--- a/Phiếu_BÁO CÁO HỌC TẬP CÁ NHÂN NHÓM.docx
+++ b/Phiếu_BÁO CÁO HỌC TẬP CÁ NHÂN NHÓM.docx
@@ -10,8 +10,6 @@
           <w:sz w:val="32"/>
         </w:rPr>
       </w:pPr>
-      <w:bookmarkStart w:id="0" w:name="_GoBack"/>
-      <w:bookmarkEnd w:id="0"/>
       <w:r>
         <w:rPr>
           <w:b/>
@@ -45,7 +43,13 @@
         <w:rPr>
           <w:color w:val="FF0000"/>
         </w:rPr>
-        <w:t>Tên lớp: ….. Khóa: …</w:t>
+        <w:t>Tên lớ</w:t>
+      </w:r>
+      <w:r>
+        <w:rPr>
+          <w:color w:val="FF0000"/>
+        </w:rPr>
+        <w:t>p: ….. Khóa: K18</w:t>
       </w:r>
     </w:p>
     <w:p>
@@ -58,7 +62,13 @@
         <w:rPr>
           <w:color w:val="FF0000"/>
         </w:rPr>
-        <w:t>Họ và tên sinh viên (nếu cá nhân thực hiện): …</w:t>
+        <w:t>Họ và tên sinh viên (nếu cá nhân thực hiệ</w:t>
+      </w:r>
+      <w:r>
+        <w:rPr>
+          <w:color w:val="FF0000"/>
+        </w:rPr>
+        <w:t>n): Lê Hà Quang</w:t>
       </w:r>
     </w:p>
     <w:p>
@@ -71,7 +81,7 @@
         <w:rPr>
           <w:color w:val="FF0000"/>
         </w:rPr>
-        <w:t>Tên nhóm:…</w:t>
+        <w:t xml:space="preserve">                                                                        Phạm Hiếu Kỳ</w:t>
       </w:r>
     </w:p>
     <w:p>
@@ -84,7 +94,58 @@
         <w:rPr>
           <w:color w:val="FF0000"/>
         </w:rPr>
-        <w:t>Tên chủ đề: ….</w:t>
+        <w:t xml:space="preserve">                                                                        Vũ Ngọc Quang</w:t>
+      </w:r>
+    </w:p>
+    <w:p>
+      <w:pPr>
+        <w:rPr>
+          <w:color w:val="FF0000"/>
+        </w:rPr>
+      </w:pPr>
+      <w:r>
+        <w:rPr>
+          <w:color w:val="FF0000"/>
+        </w:rPr>
+        <w:t xml:space="preserve">                                                                        Nguyễn Duy Thành</w:t>
+      </w:r>
+    </w:p>
+    <w:p>
+      <w:pPr>
+        <w:rPr>
+          <w:color w:val="FF0000"/>
+        </w:rPr>
+      </w:pPr>
+      <w:r>
+        <w:rPr>
+          <w:color w:val="FF0000"/>
+        </w:rPr>
+        <w:t>Tên nhóm: Nhóm 8</w:t>
+      </w:r>
+    </w:p>
+    <w:p>
+      <w:pPr>
+        <w:rPr>
+          <w:color w:val="FF0000"/>
+        </w:rPr>
+      </w:pPr>
+      <w:r>
+        <w:rPr>
+          <w:color w:val="FF0000"/>
+        </w:rPr>
+        <w:t>Tên chủ đề</w:t>
+      </w:r>
+      <w:r>
+        <w:rPr>
+          <w:color w:val="FF0000"/>
+        </w:rPr>
+        <w:t xml:space="preserve">: </w:t>
+      </w:r>
+      <w:r>
+        <w:rPr>
+          <w:color w:val="FF0000"/>
+        </w:rPr>
+        <w:t>Chuẩn AES và ứng dụng trong mã hóa dữ liệu (Sử dụng ngôn ngữ C++, C#)</w:t>
       </w:r>
     </w:p>
     <w:tbl>
@@ -220,11 +281,12 @@
       </w:tr>
       <w:tr>
         <w:trPr>
-          <w:trHeight w:val="1624"/>
+          <w:trHeight w:val="1389"/>
         </w:trPr>
         <w:tc>
           <w:tcPr>
             <w:tcW w:w="846" w:type="dxa"/>
+            <w:vMerge w:val="restart"/>
           </w:tcPr>
           <w:p>
             <w:pPr>
@@ -255,60 +317,15 @@
               <w:rPr>
                 <w:color w:val="FF0000"/>
               </w:rPr>
-              <w:t>A</w:t>
-            </w:r>
-          </w:p>
-          <w:p>
-            <w:pPr>
-              <w:rPr>
-                <w:color w:val="FF0000"/>
-              </w:rPr>
-            </w:pPr>
-            <w:r>
-              <w:rPr>
-                <w:color w:val="FF0000"/>
-              </w:rPr>
-              <w:t>B</w:t>
-            </w:r>
-          </w:p>
-          <w:p>
-            <w:pPr>
-              <w:rPr>
-                <w:color w:val="FF0000"/>
-              </w:rPr>
-            </w:pPr>
-            <w:r>
-              <w:rPr>
-                <w:color w:val="FF0000"/>
-              </w:rPr>
-              <w:t>C</w:t>
-            </w:r>
-          </w:p>
-          <w:p>
-            <w:pPr>
-              <w:rPr>
-                <w:color w:val="FF0000"/>
-              </w:rPr>
-            </w:pPr>
-            <w:r>
-              <w:rPr>
-                <w:color w:val="FF0000"/>
-              </w:rPr>
-              <w:t>D</w:t>
-            </w:r>
-          </w:p>
-          <w:p>
-            <w:pPr>
-              <w:rPr>
-                <w:color w:val="FF0000"/>
-              </w:rPr>
-            </w:pPr>
-            <w:r>
-              <w:rPr>
-                <w:color w:val="FF0000"/>
-              </w:rPr>
-              <w:t>E</w:t>
-            </w:r>
+              <w:t>Lê Hà Quang</w:t>
+            </w:r>
+          </w:p>
+          <w:p>
+            <w:pPr>
+              <w:rPr>
+                <w:color w:val="FF0000"/>
+              </w:rPr>
+            </w:pPr>
           </w:p>
         </w:tc>
         <w:tc>
@@ -325,59 +342,19 @@
               <w:rPr>
                 <w:color w:val="FF0000"/>
               </w:rPr>
-              <w:t>Công việc 1</w:t>
-            </w:r>
-          </w:p>
-          <w:p>
-            <w:pPr>
-              <w:rPr>
-                <w:color w:val="FF0000"/>
-              </w:rPr>
-            </w:pPr>
-            <w:r>
-              <w:rPr>
-                <w:color w:val="FF0000"/>
-              </w:rPr>
-              <w:t>Công việc 2</w:t>
-            </w:r>
-          </w:p>
-          <w:p>
-            <w:pPr>
-              <w:rPr>
-                <w:color w:val="FF0000"/>
-              </w:rPr>
-            </w:pPr>
-            <w:r>
-              <w:rPr>
-                <w:color w:val="FF0000"/>
-              </w:rPr>
-              <w:t>Công việc 3</w:t>
-            </w:r>
-          </w:p>
-          <w:p>
-            <w:pPr>
-              <w:rPr>
-                <w:color w:val="FF0000"/>
-              </w:rPr>
-            </w:pPr>
-            <w:r>
-              <w:rPr>
-                <w:color w:val="FF0000"/>
-              </w:rPr>
-              <w:t>Công việc 4</w:t>
-            </w:r>
-          </w:p>
-          <w:p>
-            <w:pPr>
-              <w:rPr>
-                <w:color w:val="FF0000"/>
-              </w:rPr>
-            </w:pPr>
-            <w:r>
-              <w:rPr>
-                <w:color w:val="FF0000"/>
-              </w:rPr>
-              <w:t>Công việc 5</w:t>
+              <w:t>Tạo link git hub, chỉnh sử</w:t>
+            </w:r>
+            <w:r>
+              <w:rPr>
+                <w:color w:val="FF0000"/>
+              </w:rPr>
+              <w:t xml:space="preserve">a báo cáo, </w:t>
+            </w:r>
+            <w:r>
+              <w:rPr>
+                <w:color w:val="FF0000"/>
+              </w:rPr>
+              <w:t>phân công nội dung cần thực hiện cho các thành viên</w:t>
             </w:r>
           </w:p>
         </w:tc>
@@ -391,11 +368,18 @@
                 <w:color w:val="FF0000"/>
               </w:rPr>
             </w:pPr>
+            <w:r>
+              <w:rPr>
+                <w:color w:val="FF0000"/>
+              </w:rPr>
+              <w:t>Có đường link git hub, có bản báo cáo đúng format chứa các nội dung cần triển khai</w:t>
+            </w:r>
           </w:p>
         </w:tc>
         <w:tc>
           <w:tcPr>
             <w:tcW w:w="3118" w:type="dxa"/>
+            <w:vMerge w:val="restart"/>
           </w:tcPr>
           <w:p>
             <w:pPr>
@@ -407,9 +391,13 @@
         </w:tc>
       </w:tr>
       <w:tr>
+        <w:trPr>
+          <w:trHeight w:val="288"/>
+        </w:trPr>
         <w:tc>
           <w:tcPr>
             <w:tcW w:w="846" w:type="dxa"/>
+            <w:vMerge/>
           </w:tcPr>
           <w:p>
             <w:pPr>
@@ -418,12 +406,6 @@
                 <w:color w:val="FF0000"/>
               </w:rPr>
             </w:pPr>
-            <w:r>
-              <w:rPr>
-                <w:color w:val="FF0000"/>
-              </w:rPr>
-              <w:t>2</w:t>
-            </w:r>
           </w:p>
         </w:tc>
         <w:tc>
@@ -440,59 +422,7 @@
               <w:rPr>
                 <w:color w:val="FF0000"/>
               </w:rPr>
-              <w:t>A</w:t>
-            </w:r>
-          </w:p>
-          <w:p>
-            <w:pPr>
-              <w:rPr>
-                <w:color w:val="FF0000"/>
-              </w:rPr>
-            </w:pPr>
-            <w:r>
-              <w:rPr>
-                <w:color w:val="FF0000"/>
-              </w:rPr>
-              <w:t>B</w:t>
-            </w:r>
-          </w:p>
-          <w:p>
-            <w:pPr>
-              <w:rPr>
-                <w:color w:val="FF0000"/>
-              </w:rPr>
-            </w:pPr>
-            <w:r>
-              <w:rPr>
-                <w:color w:val="FF0000"/>
-              </w:rPr>
-              <w:t>C</w:t>
-            </w:r>
-          </w:p>
-          <w:p>
-            <w:pPr>
-              <w:rPr>
-                <w:color w:val="FF0000"/>
-              </w:rPr>
-            </w:pPr>
-            <w:r>
-              <w:rPr>
-                <w:color w:val="FF0000"/>
-              </w:rPr>
-              <w:t>D</w:t>
-            </w:r>
-          </w:p>
-          <w:p>
-            <w:pPr>
-              <w:rPr>
-                <w:color w:val="FF0000"/>
-              </w:rPr>
-            </w:pPr>
-            <w:r>
-              <w:rPr>
-                <w:color w:val="FF0000"/>
-              </w:rPr>
-              <w:t>E</w:t>
+              <w:t>Vũ Ngọc Quang</w:t>
             </w:r>
           </w:p>
         </w:tc>
@@ -510,59 +440,19 @@
               <w:rPr>
                 <w:color w:val="FF0000"/>
               </w:rPr>
-              <w:t>Công việc 1</w:t>
-            </w:r>
-          </w:p>
-          <w:p>
-            <w:pPr>
-              <w:rPr>
-                <w:color w:val="FF0000"/>
-              </w:rPr>
-            </w:pPr>
-            <w:r>
-              <w:rPr>
-                <w:color w:val="FF0000"/>
-              </w:rPr>
-              <w:t>Công việc 2</w:t>
-            </w:r>
-          </w:p>
-          <w:p>
-            <w:pPr>
-              <w:rPr>
-                <w:color w:val="FF0000"/>
-              </w:rPr>
-            </w:pPr>
-            <w:r>
-              <w:rPr>
-                <w:color w:val="FF0000"/>
-              </w:rPr>
-              <w:t>Công việc 3</w:t>
-            </w:r>
-          </w:p>
-          <w:p>
-            <w:pPr>
-              <w:rPr>
-                <w:color w:val="FF0000"/>
-              </w:rPr>
-            </w:pPr>
-            <w:r>
-              <w:rPr>
-                <w:color w:val="FF0000"/>
-              </w:rPr>
-              <w:t>Công việc 4</w:t>
-            </w:r>
-          </w:p>
-          <w:p>
-            <w:pPr>
-              <w:rPr>
-                <w:color w:val="FF0000"/>
-              </w:rPr>
-            </w:pPr>
-            <w:r>
-              <w:rPr>
-                <w:color w:val="FF0000"/>
-              </w:rPr>
-              <w:t>Công việc 5</w:t>
+              <w:t>Tìm hiểu về khái niệm và vai trò củ</w:t>
+            </w:r>
+            <w:r>
+              <w:rPr>
+                <w:color w:val="FF0000"/>
+              </w:rPr>
+              <w:t>a an ninh</w:t>
+            </w:r>
+            <w:r>
+              <w:rPr>
+                <w:color w:val="FF0000"/>
+              </w:rPr>
+              <w:t xml:space="preserve"> mạng </w:t>
             </w:r>
           </w:p>
         </w:tc>
@@ -576,11 +466,18 @@
                 <w:color w:val="FF0000"/>
               </w:rPr>
             </w:pPr>
+            <w:r>
+              <w:rPr>
+                <w:color w:val="FF0000"/>
+              </w:rPr>
+              <w:t>Có được bản word nội dung, nhưng chưa chỉnh sửa bố cục</w:t>
+            </w:r>
           </w:p>
         </w:tc>
         <w:tc>
           <w:tcPr>
             <w:tcW w:w="3118" w:type="dxa"/>
+            <w:vMerge/>
           </w:tcPr>
           <w:p>
             <w:pPr>
@@ -592,9 +489,13 @@
         </w:tc>
       </w:tr>
       <w:tr>
+        <w:trPr>
+          <w:trHeight w:val="58"/>
+        </w:trPr>
         <w:tc>
           <w:tcPr>
             <w:tcW w:w="846" w:type="dxa"/>
+            <w:vMerge/>
           </w:tcPr>
           <w:p>
             <w:pPr>
@@ -603,12 +504,6 @@
                 <w:color w:val="FF0000"/>
               </w:rPr>
             </w:pPr>
-            <w:r>
-              <w:rPr>
-                <w:color w:val="FF0000"/>
-              </w:rPr>
-              <w:t>3</w:t>
-            </w:r>
           </w:p>
         </w:tc>
         <w:tc>
@@ -625,59 +520,7 @@
               <w:rPr>
                 <w:color w:val="FF0000"/>
               </w:rPr>
-              <w:t>A</w:t>
-            </w:r>
-          </w:p>
-          <w:p>
-            <w:pPr>
-              <w:rPr>
-                <w:color w:val="FF0000"/>
-              </w:rPr>
-            </w:pPr>
-            <w:r>
-              <w:rPr>
-                <w:color w:val="FF0000"/>
-              </w:rPr>
-              <w:t>B</w:t>
-            </w:r>
-          </w:p>
-          <w:p>
-            <w:pPr>
-              <w:rPr>
-                <w:color w:val="FF0000"/>
-              </w:rPr>
-            </w:pPr>
-            <w:r>
-              <w:rPr>
-                <w:color w:val="FF0000"/>
-              </w:rPr>
-              <w:t>C</w:t>
-            </w:r>
-          </w:p>
-          <w:p>
-            <w:pPr>
-              <w:rPr>
-                <w:color w:val="FF0000"/>
-              </w:rPr>
-            </w:pPr>
-            <w:r>
-              <w:rPr>
-                <w:color w:val="FF0000"/>
-              </w:rPr>
-              <w:t>D</w:t>
-            </w:r>
-          </w:p>
-          <w:p>
-            <w:pPr>
-              <w:rPr>
-                <w:color w:val="FF0000"/>
-              </w:rPr>
-            </w:pPr>
-            <w:r>
-              <w:rPr>
-                <w:color w:val="FF0000"/>
-              </w:rPr>
-              <w:t>E</w:t>
+              <w:t>Phạm Hiếu Kỳ</w:t>
             </w:r>
           </w:p>
         </w:tc>
@@ -695,59 +538,7 @@
               <w:rPr>
                 <w:color w:val="FF0000"/>
               </w:rPr>
-              <w:t>Công việc 1</w:t>
-            </w:r>
-          </w:p>
-          <w:p>
-            <w:pPr>
-              <w:rPr>
-                <w:color w:val="FF0000"/>
-              </w:rPr>
-            </w:pPr>
-            <w:r>
-              <w:rPr>
-                <w:color w:val="FF0000"/>
-              </w:rPr>
-              <w:t>Công việc 2</w:t>
-            </w:r>
-          </w:p>
-          <w:p>
-            <w:pPr>
-              <w:rPr>
-                <w:color w:val="FF0000"/>
-              </w:rPr>
-            </w:pPr>
-            <w:r>
-              <w:rPr>
-                <w:color w:val="FF0000"/>
-              </w:rPr>
-              <w:t>Công việc 3</w:t>
-            </w:r>
-          </w:p>
-          <w:p>
-            <w:pPr>
-              <w:rPr>
-                <w:color w:val="FF0000"/>
-              </w:rPr>
-            </w:pPr>
-            <w:r>
-              <w:rPr>
-                <w:color w:val="FF0000"/>
-              </w:rPr>
-              <w:t>Công việc 4</w:t>
-            </w:r>
-          </w:p>
-          <w:p>
-            <w:pPr>
-              <w:rPr>
-                <w:color w:val="FF0000"/>
-              </w:rPr>
-            </w:pPr>
-            <w:r>
-              <w:rPr>
-                <w:color w:val="FF0000"/>
-              </w:rPr>
-              <w:t>Công việc 5</w:t>
+              <w:t>Tìm hiểu các nội dung nghiên cứu, lý do chọn đề tài, mục tiêu đối tượng, phạm vi nghiên cứu</w:t>
             </w:r>
           </w:p>
         </w:tc>
@@ -761,11 +552,18 @@
                 <w:color w:val="FF0000"/>
               </w:rPr>
             </w:pPr>
+            <w:r>
+              <w:rPr>
+                <w:color w:val="FF0000"/>
+              </w:rPr>
+              <w:t>Có bản word nội dung hoàn chỉnh</w:t>
+            </w:r>
           </w:p>
         </w:tc>
         <w:tc>
           <w:tcPr>
             <w:tcW w:w="3118" w:type="dxa"/>
+            <w:vMerge/>
           </w:tcPr>
           <w:p>
             <w:pPr>
@@ -777,9 +575,13 @@
         </w:tc>
       </w:tr>
       <w:tr>
+        <w:trPr>
+          <w:trHeight w:val="324"/>
+        </w:trPr>
         <w:tc>
           <w:tcPr>
             <w:tcW w:w="846" w:type="dxa"/>
+            <w:vMerge/>
           </w:tcPr>
           <w:p>
             <w:pPr>
@@ -788,6 +590,639 @@
                 <w:color w:val="FF0000"/>
               </w:rPr>
             </w:pPr>
+          </w:p>
+        </w:tc>
+        <w:tc>
+          <w:tcPr>
+            <w:tcW w:w="2268" w:type="dxa"/>
+          </w:tcPr>
+          <w:p>
+            <w:pPr>
+              <w:rPr>
+                <w:color w:val="FF0000"/>
+              </w:rPr>
+            </w:pPr>
+            <w:r>
+              <w:rPr>
+                <w:color w:val="FF0000"/>
+              </w:rPr>
+              <w:t>Nguyễn Duy Thành</w:t>
+            </w:r>
+          </w:p>
+        </w:tc>
+        <w:tc>
+          <w:tcPr>
+            <w:tcW w:w="3827" w:type="dxa"/>
+          </w:tcPr>
+          <w:p>
+            <w:pPr>
+              <w:rPr>
+                <w:color w:val="FF0000"/>
+              </w:rPr>
+            </w:pPr>
+            <w:r>
+              <w:rPr>
+                <w:color w:val="FF0000"/>
+              </w:rPr>
+              <w:t>Tìm hiểu về cơ sở toán học của các thuật toán mã hóa giới thiệu sơ lược về ngôn ngữ sẽ dùng để làm demo</w:t>
+            </w:r>
+          </w:p>
+        </w:tc>
+        <w:tc>
+          <w:tcPr>
+            <w:tcW w:w="3119" w:type="dxa"/>
+          </w:tcPr>
+          <w:p>
+            <w:pPr>
+              <w:rPr>
+                <w:color w:val="FF0000"/>
+              </w:rPr>
+            </w:pPr>
+            <w:r>
+              <w:rPr>
+                <w:color w:val="FF0000"/>
+              </w:rPr>
+              <w:t>Có bản word nội dung hoàn chỉnh nhưng cần bổ sung thêm ngôn ngữ c++</w:t>
+            </w:r>
+          </w:p>
+        </w:tc>
+        <w:tc>
+          <w:tcPr>
+            <w:tcW w:w="3118" w:type="dxa"/>
+            <w:vMerge/>
+          </w:tcPr>
+          <w:p>
+            <w:pPr>
+              <w:rPr>
+                <w:color w:val="FF0000"/>
+              </w:rPr>
+            </w:pPr>
+          </w:p>
+        </w:tc>
+      </w:tr>
+      <w:tr>
+        <w:trPr>
+          <w:trHeight w:val="300"/>
+        </w:trPr>
+        <w:tc>
+          <w:tcPr>
+            <w:tcW w:w="846" w:type="dxa"/>
+            <w:vMerge w:val="restart"/>
+          </w:tcPr>
+          <w:p>
+            <w:pPr>
+              <w:jc w:val="center"/>
+              <w:rPr>
+                <w:color w:val="FF0000"/>
+              </w:rPr>
+            </w:pPr>
+            <w:r>
+              <w:rPr>
+                <w:color w:val="FF0000"/>
+              </w:rPr>
+              <w:lastRenderedPageBreak/>
+              <w:t>2</w:t>
+            </w:r>
+          </w:p>
+        </w:tc>
+        <w:tc>
+          <w:tcPr>
+            <w:tcW w:w="2268" w:type="dxa"/>
+          </w:tcPr>
+          <w:p>
+            <w:pPr>
+              <w:rPr>
+                <w:color w:val="FF0000"/>
+              </w:rPr>
+            </w:pPr>
+            <w:r>
+              <w:rPr>
+                <w:color w:val="FF0000"/>
+              </w:rPr>
+              <w:t>Lê Hà Quang</w:t>
+            </w:r>
+          </w:p>
+          <w:p>
+            <w:pPr>
+              <w:rPr>
+                <w:color w:val="FF0000"/>
+              </w:rPr>
+            </w:pPr>
+          </w:p>
+        </w:tc>
+        <w:tc>
+          <w:tcPr>
+            <w:tcW w:w="3827" w:type="dxa"/>
+          </w:tcPr>
+          <w:p>
+            <w:pPr>
+              <w:rPr>
+                <w:color w:val="FF0000"/>
+              </w:rPr>
+            </w:pPr>
+            <w:r>
+              <w:rPr>
+                <w:color w:val="FF0000"/>
+              </w:rPr>
+              <w:t>Tổng hợp lại nội dung của tuần 1, viết vào bản báo cáo, thêm và chỉnh sửa lại nội dung cho phù hợp</w:t>
+            </w:r>
+          </w:p>
+        </w:tc>
+        <w:tc>
+          <w:tcPr>
+            <w:tcW w:w="3119" w:type="dxa"/>
+          </w:tcPr>
+          <w:p>
+            <w:pPr>
+              <w:rPr>
+                <w:color w:val="FF0000"/>
+              </w:rPr>
+            </w:pPr>
+            <w:r>
+              <w:rPr>
+                <w:color w:val="FF0000"/>
+              </w:rPr>
+              <w:t>Có bản báo cáo nội dung đầy đủ của chương 1</w:t>
+            </w:r>
+          </w:p>
+        </w:tc>
+        <w:tc>
+          <w:tcPr>
+            <w:tcW w:w="3118" w:type="dxa"/>
+            <w:vMerge w:val="restart"/>
+          </w:tcPr>
+          <w:p>
+            <w:pPr>
+              <w:rPr>
+                <w:color w:val="FF0000"/>
+              </w:rPr>
+            </w:pPr>
+          </w:p>
+        </w:tc>
+      </w:tr>
+      <w:tr>
+        <w:trPr>
+          <w:trHeight w:val="324"/>
+        </w:trPr>
+        <w:tc>
+          <w:tcPr>
+            <w:tcW w:w="846" w:type="dxa"/>
+            <w:vMerge/>
+          </w:tcPr>
+          <w:p>
+            <w:pPr>
+              <w:jc w:val="center"/>
+              <w:rPr>
+                <w:color w:val="FF0000"/>
+              </w:rPr>
+            </w:pPr>
+          </w:p>
+        </w:tc>
+        <w:tc>
+          <w:tcPr>
+            <w:tcW w:w="2268" w:type="dxa"/>
+          </w:tcPr>
+          <w:p>
+            <w:pPr>
+              <w:rPr>
+                <w:color w:val="FF0000"/>
+              </w:rPr>
+            </w:pPr>
+            <w:r>
+              <w:rPr>
+                <w:color w:val="FF0000"/>
+              </w:rPr>
+              <w:t>Vũ Ngọc Quang</w:t>
+            </w:r>
+          </w:p>
+        </w:tc>
+        <w:tc>
+          <w:tcPr>
+            <w:tcW w:w="3827" w:type="dxa"/>
+          </w:tcPr>
+          <w:p>
+            <w:pPr>
+              <w:rPr>
+                <w:color w:val="FF0000"/>
+              </w:rPr>
+            </w:pPr>
+            <w:r>
+              <w:rPr>
+                <w:color w:val="FF0000"/>
+              </w:rPr>
+              <w:t>Tìm hiểu về các ứng dụng thực tế của AES</w:t>
+            </w:r>
+          </w:p>
+        </w:tc>
+        <w:tc>
+          <w:tcPr>
+            <w:tcW w:w="3119" w:type="dxa"/>
+          </w:tcPr>
+          <w:p>
+            <w:pPr>
+              <w:rPr>
+                <w:color w:val="FF0000"/>
+              </w:rPr>
+            </w:pPr>
+            <w:r>
+              <w:rPr>
+                <w:color w:val="FF0000"/>
+              </w:rPr>
+              <w:t>Có bản word chứa nội dung tìm hiểu</w:t>
+            </w:r>
+            <w:r>
+              <w:rPr>
+                <w:color w:val="FF0000"/>
+              </w:rPr>
+              <w:t xml:space="preserve">  </w:t>
+            </w:r>
+          </w:p>
+        </w:tc>
+        <w:tc>
+          <w:tcPr>
+            <w:tcW w:w="3118" w:type="dxa"/>
+            <w:vMerge/>
+          </w:tcPr>
+          <w:p>
+            <w:pPr>
+              <w:rPr>
+                <w:color w:val="FF0000"/>
+              </w:rPr>
+            </w:pPr>
+          </w:p>
+        </w:tc>
+      </w:tr>
+      <w:tr>
+        <w:trPr>
+          <w:trHeight w:val="432"/>
+        </w:trPr>
+        <w:tc>
+          <w:tcPr>
+            <w:tcW w:w="846" w:type="dxa"/>
+            <w:vMerge/>
+          </w:tcPr>
+          <w:p>
+            <w:pPr>
+              <w:jc w:val="center"/>
+              <w:rPr>
+                <w:color w:val="FF0000"/>
+              </w:rPr>
+            </w:pPr>
+          </w:p>
+        </w:tc>
+        <w:tc>
+          <w:tcPr>
+            <w:tcW w:w="2268" w:type="dxa"/>
+          </w:tcPr>
+          <w:p>
+            <w:pPr>
+              <w:rPr>
+                <w:color w:val="FF0000"/>
+              </w:rPr>
+            </w:pPr>
+            <w:r>
+              <w:rPr>
+                <w:color w:val="FF0000"/>
+              </w:rPr>
+              <w:t>Phạm Hiếu Kỳ</w:t>
+            </w:r>
+          </w:p>
+        </w:tc>
+        <w:tc>
+          <w:tcPr>
+            <w:tcW w:w="3827" w:type="dxa"/>
+          </w:tcPr>
+          <w:p>
+            <w:pPr>
+              <w:rPr>
+                <w:color w:val="FF0000"/>
+              </w:rPr>
+            </w:pPr>
+            <w:r>
+              <w:rPr>
+                <w:color w:val="FF0000"/>
+              </w:rPr>
+              <w:t>Tìm hiểu về lịch sử hình thành và các thông số kỹ thuật của AES</w:t>
+            </w:r>
+          </w:p>
+        </w:tc>
+        <w:tc>
+          <w:tcPr>
+            <w:tcW w:w="3119" w:type="dxa"/>
+          </w:tcPr>
+          <w:p>
+            <w:pPr>
+              <w:rPr>
+                <w:color w:val="FF0000"/>
+              </w:rPr>
+            </w:pPr>
+            <w:r>
+              <w:rPr>
+                <w:color w:val="FF0000"/>
+              </w:rPr>
+              <w:t>Có bản word chứa nội dung cần tìm hiểu nhưng nội dung hơi dài</w:t>
+            </w:r>
+          </w:p>
+        </w:tc>
+        <w:tc>
+          <w:tcPr>
+            <w:tcW w:w="3118" w:type="dxa"/>
+            <w:vMerge/>
+          </w:tcPr>
+          <w:p>
+            <w:pPr>
+              <w:rPr>
+                <w:color w:val="FF0000"/>
+              </w:rPr>
+            </w:pPr>
+          </w:p>
+        </w:tc>
+      </w:tr>
+      <w:tr>
+        <w:trPr>
+          <w:trHeight w:val="408"/>
+        </w:trPr>
+        <w:tc>
+          <w:tcPr>
+            <w:tcW w:w="846" w:type="dxa"/>
+            <w:vMerge/>
+          </w:tcPr>
+          <w:p>
+            <w:pPr>
+              <w:jc w:val="center"/>
+              <w:rPr>
+                <w:color w:val="FF0000"/>
+              </w:rPr>
+            </w:pPr>
+          </w:p>
+        </w:tc>
+        <w:tc>
+          <w:tcPr>
+            <w:tcW w:w="2268" w:type="dxa"/>
+          </w:tcPr>
+          <w:p>
+            <w:pPr>
+              <w:rPr>
+                <w:color w:val="FF0000"/>
+              </w:rPr>
+            </w:pPr>
+            <w:r>
+              <w:rPr>
+                <w:color w:val="FF0000"/>
+              </w:rPr>
+              <w:t>Nguyễn Duy Thành</w:t>
+            </w:r>
+          </w:p>
+        </w:tc>
+        <w:tc>
+          <w:tcPr>
+            <w:tcW w:w="3827" w:type="dxa"/>
+          </w:tcPr>
+          <w:p>
+            <w:pPr>
+              <w:rPr>
+                <w:color w:val="FF0000"/>
+              </w:rPr>
+            </w:pPr>
+            <w:r>
+              <w:rPr>
+                <w:color w:val="FF0000"/>
+              </w:rPr>
+              <w:t>Tìm hiểu về bản chất và nguyên lý hoạt động của AES</w:t>
+            </w:r>
+          </w:p>
+        </w:tc>
+        <w:tc>
+          <w:tcPr>
+            <w:tcW w:w="3119" w:type="dxa"/>
+          </w:tcPr>
+          <w:p>
+            <w:pPr>
+              <w:rPr>
+                <w:color w:val="FF0000"/>
+              </w:rPr>
+            </w:pPr>
+            <w:r>
+              <w:rPr>
+                <w:color w:val="FF0000"/>
+              </w:rPr>
+              <w:t>Có bản word chứa nội dung cần tìm hiểu, chưa có ảnh minh họa</w:t>
+            </w:r>
+            <w:bookmarkStart w:id="0" w:name="_GoBack"/>
+            <w:bookmarkEnd w:id="0"/>
+          </w:p>
+        </w:tc>
+        <w:tc>
+          <w:tcPr>
+            <w:tcW w:w="3118" w:type="dxa"/>
+            <w:vMerge/>
+          </w:tcPr>
+          <w:p>
+            <w:pPr>
+              <w:rPr>
+                <w:color w:val="FF0000"/>
+              </w:rPr>
+            </w:pPr>
+          </w:p>
+        </w:tc>
+      </w:tr>
+      <w:tr>
+        <w:tc>
+          <w:tcPr>
+            <w:tcW w:w="846" w:type="dxa"/>
+          </w:tcPr>
+          <w:p>
+            <w:pPr>
+              <w:jc w:val="center"/>
+              <w:rPr>
+                <w:color w:val="FF0000"/>
+              </w:rPr>
+            </w:pPr>
+            <w:r>
+              <w:rPr>
+                <w:color w:val="FF0000"/>
+              </w:rPr>
+              <w:t>3</w:t>
+            </w:r>
+          </w:p>
+        </w:tc>
+        <w:tc>
+          <w:tcPr>
+            <w:tcW w:w="2268" w:type="dxa"/>
+          </w:tcPr>
+          <w:p>
+            <w:pPr>
+              <w:rPr>
+                <w:color w:val="FF0000"/>
+              </w:rPr>
+            </w:pPr>
+            <w:r>
+              <w:rPr>
+                <w:color w:val="FF0000"/>
+              </w:rPr>
+              <w:t>A</w:t>
+            </w:r>
+          </w:p>
+          <w:p>
+            <w:pPr>
+              <w:rPr>
+                <w:color w:val="FF0000"/>
+              </w:rPr>
+            </w:pPr>
+            <w:r>
+              <w:rPr>
+                <w:color w:val="FF0000"/>
+              </w:rPr>
+              <w:t>B</w:t>
+            </w:r>
+          </w:p>
+          <w:p>
+            <w:pPr>
+              <w:rPr>
+                <w:color w:val="FF0000"/>
+              </w:rPr>
+            </w:pPr>
+            <w:r>
+              <w:rPr>
+                <w:color w:val="FF0000"/>
+              </w:rPr>
+              <w:t>C</w:t>
+            </w:r>
+          </w:p>
+          <w:p>
+            <w:pPr>
+              <w:rPr>
+                <w:color w:val="FF0000"/>
+              </w:rPr>
+            </w:pPr>
+            <w:r>
+              <w:rPr>
+                <w:color w:val="FF0000"/>
+              </w:rPr>
+              <w:t>D</w:t>
+            </w:r>
+          </w:p>
+          <w:p>
+            <w:pPr>
+              <w:rPr>
+                <w:color w:val="FF0000"/>
+              </w:rPr>
+            </w:pPr>
+            <w:r>
+              <w:rPr>
+                <w:color w:val="FF0000"/>
+              </w:rPr>
+              <w:t>E</w:t>
+            </w:r>
+          </w:p>
+        </w:tc>
+        <w:tc>
+          <w:tcPr>
+            <w:tcW w:w="3827" w:type="dxa"/>
+          </w:tcPr>
+          <w:p>
+            <w:pPr>
+              <w:rPr>
+                <w:color w:val="FF0000"/>
+              </w:rPr>
+            </w:pPr>
+            <w:r>
+              <w:rPr>
+                <w:color w:val="FF0000"/>
+              </w:rPr>
+              <w:t>Công việc 1</w:t>
+            </w:r>
+          </w:p>
+          <w:p>
+            <w:pPr>
+              <w:rPr>
+                <w:color w:val="FF0000"/>
+              </w:rPr>
+            </w:pPr>
+            <w:r>
+              <w:rPr>
+                <w:color w:val="FF0000"/>
+              </w:rPr>
+              <w:t>Công việc 2</w:t>
+            </w:r>
+          </w:p>
+          <w:p>
+            <w:pPr>
+              <w:rPr>
+                <w:color w:val="FF0000"/>
+              </w:rPr>
+            </w:pPr>
+            <w:r>
+              <w:rPr>
+                <w:color w:val="FF0000"/>
+              </w:rPr>
+              <w:t>Công việc 3</w:t>
+            </w:r>
+          </w:p>
+          <w:p>
+            <w:pPr>
+              <w:rPr>
+                <w:color w:val="FF0000"/>
+              </w:rPr>
+            </w:pPr>
+            <w:r>
+              <w:rPr>
+                <w:color w:val="FF0000"/>
+              </w:rPr>
+              <w:t>Công việc 4</w:t>
+            </w:r>
+          </w:p>
+          <w:p>
+            <w:pPr>
+              <w:rPr>
+                <w:color w:val="FF0000"/>
+              </w:rPr>
+            </w:pPr>
+            <w:r>
+              <w:rPr>
+                <w:color w:val="FF0000"/>
+              </w:rPr>
+              <w:t>Công việc 5</w:t>
+            </w:r>
+          </w:p>
+        </w:tc>
+        <w:tc>
+          <w:tcPr>
+            <w:tcW w:w="3119" w:type="dxa"/>
+          </w:tcPr>
+          <w:p>
+            <w:pPr>
+              <w:rPr>
+                <w:color w:val="FF0000"/>
+              </w:rPr>
+            </w:pPr>
+          </w:p>
+        </w:tc>
+        <w:tc>
+          <w:tcPr>
+            <w:tcW w:w="3118" w:type="dxa"/>
+          </w:tcPr>
+          <w:p>
+            <w:pPr>
+              <w:rPr>
+                <w:color w:val="FF0000"/>
+              </w:rPr>
+            </w:pPr>
+          </w:p>
+        </w:tc>
+      </w:tr>
+      <w:tr>
+        <w:tc>
+          <w:tcPr>
+            <w:tcW w:w="846" w:type="dxa"/>
+          </w:tcPr>
+          <w:p>
+            <w:pPr>
+              <w:jc w:val="center"/>
+              <w:rPr>
+                <w:color w:val="FF0000"/>
+              </w:rPr>
+            </w:pPr>
             <w:r>
               <w:rPr>
                 <w:color w:val="FF0000"/>
@@ -862,7 +1297,6 @@
               <w:rPr>
                 <w:color w:val="FF0000"/>
               </w:rPr>
-              <w:lastRenderedPageBreak/>
               <w:t>E</w:t>
             </w:r>
           </w:p>
@@ -881,7 +1315,6 @@
               <w:rPr>
                 <w:color w:val="FF0000"/>
               </w:rPr>
-              <w:lastRenderedPageBreak/>
               <w:t>Công việc 1</w:t>
             </w:r>
           </w:p>
@@ -934,7 +1367,6 @@
               <w:rPr>
                 <w:color w:val="FF0000"/>
               </w:rPr>
-              <w:lastRenderedPageBreak/>
               <w:t>Công việc 5</w:t>
             </w:r>
           </w:p>
@@ -2181,9 +2613,13 @@
         </w:tc>
       </w:tr>
       <w:tr>
+        <w:trPr>
+          <w:trHeight w:val="312"/>
+        </w:trPr>
         <w:tc>
           <w:tcPr>
             <w:tcW w:w="846" w:type="dxa"/>
+            <w:vMerge w:val="restart"/>
           </w:tcPr>
           <w:p>
             <w:pPr>
@@ -2230,45 +2666,6 @@
               <w:t>B</w:t>
             </w:r>
           </w:p>
-          <w:p>
-            <w:pPr>
-              <w:rPr>
-                <w:color w:val="FF0000"/>
-              </w:rPr>
-            </w:pPr>
-            <w:r>
-              <w:rPr>
-                <w:color w:val="FF0000"/>
-              </w:rPr>
-              <w:t>C</w:t>
-            </w:r>
-          </w:p>
-          <w:p>
-            <w:pPr>
-              <w:rPr>
-                <w:color w:val="FF0000"/>
-              </w:rPr>
-            </w:pPr>
-            <w:r>
-              <w:rPr>
-                <w:color w:val="FF0000"/>
-              </w:rPr>
-              <w:t>D</w:t>
-            </w:r>
-          </w:p>
-          <w:p>
-            <w:pPr>
-              <w:rPr>
-                <w:color w:val="FF0000"/>
-              </w:rPr>
-            </w:pPr>
-            <w:r>
-              <w:rPr>
-                <w:color w:val="FF0000"/>
-              </w:rPr>
-              <w:t>E</w:t>
-            </w:r>
-          </w:p>
         </w:tc>
         <w:tc>
           <w:tcPr>
@@ -2298,45 +2695,6 @@
                 <w:color w:val="FF0000"/>
               </w:rPr>
               <w:t>Công việc 2</w:t>
-            </w:r>
-          </w:p>
-          <w:p>
-            <w:pPr>
-              <w:rPr>
-                <w:color w:val="FF0000"/>
-              </w:rPr>
-            </w:pPr>
-            <w:r>
-              <w:rPr>
-                <w:color w:val="FF0000"/>
-              </w:rPr>
-              <w:t>Công việc 3</w:t>
-            </w:r>
-          </w:p>
-          <w:p>
-            <w:pPr>
-              <w:rPr>
-                <w:color w:val="FF0000"/>
-              </w:rPr>
-            </w:pPr>
-            <w:r>
-              <w:rPr>
-                <w:color w:val="FF0000"/>
-              </w:rPr>
-              <w:t>Công việc 4</w:t>
-            </w:r>
-          </w:p>
-          <w:p>
-            <w:pPr>
-              <w:rPr>
-                <w:color w:val="FF0000"/>
-              </w:rPr>
-            </w:pPr>
-            <w:r>
-              <w:rPr>
-                <w:color w:val="FF0000"/>
-              </w:rPr>
-              <w:t>Công việc 5</w:t>
             </w:r>
           </w:p>
         </w:tc>
@@ -2354,9 +2712,13 @@
         </w:tc>
       </w:tr>
       <w:tr>
+        <w:trPr>
+          <w:trHeight w:val="276"/>
+        </w:trPr>
         <w:tc>
           <w:tcPr>
             <w:tcW w:w="846" w:type="dxa"/>
+            <w:vMerge/>
           </w:tcPr>
           <w:p>
             <w:pPr>
@@ -2365,12 +2727,6 @@
                 <w:color w:val="FF0000"/>
               </w:rPr>
             </w:pPr>
-            <w:r>
-              <w:rPr>
-                <w:color w:val="FF0000"/>
-              </w:rPr>
-              <w:t>2</w:t>
-            </w:r>
           </w:p>
         </w:tc>
         <w:tc>
@@ -2387,61 +2743,9 @@
               <w:rPr>
                 <w:color w:val="FF0000"/>
               </w:rPr>
-              <w:t>A</w:t>
-            </w:r>
-          </w:p>
-          <w:p>
-            <w:pPr>
-              <w:rPr>
-                <w:color w:val="FF0000"/>
-              </w:rPr>
-            </w:pPr>
-            <w:r>
-              <w:rPr>
-                <w:color w:val="FF0000"/>
-              </w:rPr>
-              <w:t>B</w:t>
-            </w:r>
-          </w:p>
-          <w:p>
-            <w:pPr>
-              <w:rPr>
-                <w:color w:val="FF0000"/>
-              </w:rPr>
-            </w:pPr>
-            <w:r>
-              <w:rPr>
-                <w:color w:val="FF0000"/>
-              </w:rPr>
               <w:t>C</w:t>
             </w:r>
           </w:p>
-          <w:p>
-            <w:pPr>
-              <w:rPr>
-                <w:color w:val="FF0000"/>
-              </w:rPr>
-            </w:pPr>
-            <w:r>
-              <w:rPr>
-                <w:color w:val="FF0000"/>
-              </w:rPr>
-              <w:t>D</w:t>
-            </w:r>
-          </w:p>
-          <w:p>
-            <w:pPr>
-              <w:rPr>
-                <w:color w:val="FF0000"/>
-              </w:rPr>
-            </w:pPr>
-            <w:r>
-              <w:rPr>
-                <w:color w:val="FF0000"/>
-              </w:rPr>
-              <w:t>E</w:t>
-            </w:r>
-          </w:p>
         </w:tc>
         <w:tc>
           <w:tcPr>
@@ -2457,59 +2761,7 @@
               <w:rPr>
                 <w:color w:val="FF0000"/>
               </w:rPr>
-              <w:t>Công việc 1</w:t>
-            </w:r>
-          </w:p>
-          <w:p>
-            <w:pPr>
-              <w:rPr>
-                <w:color w:val="FF0000"/>
-              </w:rPr>
-            </w:pPr>
-            <w:r>
-              <w:rPr>
-                <w:color w:val="FF0000"/>
-              </w:rPr>
-              <w:t>Công việc 2</w:t>
-            </w:r>
-          </w:p>
-          <w:p>
-            <w:pPr>
-              <w:rPr>
-                <w:color w:val="FF0000"/>
-              </w:rPr>
-            </w:pPr>
-            <w:r>
-              <w:rPr>
-                <w:color w:val="FF0000"/>
-              </w:rPr>
               <w:t>Công việc 3</w:t>
-            </w:r>
-          </w:p>
-          <w:p>
-            <w:pPr>
-              <w:rPr>
-                <w:color w:val="FF0000"/>
-              </w:rPr>
-            </w:pPr>
-            <w:r>
-              <w:rPr>
-                <w:color w:val="FF0000"/>
-              </w:rPr>
-              <w:t>Công việc 4</w:t>
-            </w:r>
-          </w:p>
-          <w:p>
-            <w:pPr>
-              <w:rPr>
-                <w:color w:val="FF0000"/>
-              </w:rPr>
-            </w:pPr>
-            <w:r>
-              <w:rPr>
-                <w:color w:val="FF0000"/>
-              </w:rPr>
-              <w:t>Công việc 5</w:t>
             </w:r>
           </w:p>
         </w:tc>
@@ -2527,9 +2779,13 @@
         </w:tc>
       </w:tr>
       <w:tr>
+        <w:trPr>
+          <w:trHeight w:val="336"/>
+        </w:trPr>
         <w:tc>
           <w:tcPr>
             <w:tcW w:w="846" w:type="dxa"/>
+            <w:vMerge/>
           </w:tcPr>
           <w:p>
             <w:pPr>
@@ -2538,12 +2794,6 @@
                 <w:color w:val="FF0000"/>
               </w:rPr>
             </w:pPr>
-            <w:r>
-              <w:rPr>
-                <w:color w:val="FF0000"/>
-              </w:rPr>
-              <w:t>3</w:t>
-            </w:r>
           </w:p>
         </w:tc>
         <w:tc>
@@ -2560,45 +2810,6 @@
               <w:rPr>
                 <w:color w:val="FF0000"/>
               </w:rPr>
-              <w:t>A</w:t>
-            </w:r>
-          </w:p>
-          <w:p>
-            <w:pPr>
-              <w:rPr>
-                <w:color w:val="FF0000"/>
-              </w:rPr>
-            </w:pPr>
-            <w:r>
-              <w:rPr>
-                <w:color w:val="FF0000"/>
-              </w:rPr>
-              <w:t>B</w:t>
-            </w:r>
-          </w:p>
-          <w:p>
-            <w:pPr>
-              <w:rPr>
-                <w:color w:val="FF0000"/>
-              </w:rPr>
-            </w:pPr>
-            <w:r>
-              <w:rPr>
-                <w:color w:val="FF0000"/>
-              </w:rPr>
-              <w:t>C</w:t>
-            </w:r>
-          </w:p>
-          <w:p>
-            <w:pPr>
-              <w:rPr>
-                <w:color w:val="FF0000"/>
-              </w:rPr>
-            </w:pPr>
-            <w:r>
-              <w:rPr>
-                <w:color w:val="FF0000"/>
-              </w:rPr>
               <w:t>D</w:t>
             </w:r>
           </w:p>
@@ -2620,45 +2831,6 @@
           <w:tcPr>
             <w:tcW w:w="5528" w:type="dxa"/>
           </w:tcPr>
-          <w:p>
-            <w:pPr>
-              <w:rPr>
-                <w:color w:val="FF0000"/>
-              </w:rPr>
-            </w:pPr>
-            <w:r>
-              <w:rPr>
-                <w:color w:val="FF0000"/>
-              </w:rPr>
-              <w:t>Công việc 1</w:t>
-            </w:r>
-          </w:p>
-          <w:p>
-            <w:pPr>
-              <w:rPr>
-                <w:color w:val="FF0000"/>
-              </w:rPr>
-            </w:pPr>
-            <w:r>
-              <w:rPr>
-                <w:color w:val="FF0000"/>
-              </w:rPr>
-              <w:t>Công việc 2</w:t>
-            </w:r>
-          </w:p>
-          <w:p>
-            <w:pPr>
-              <w:rPr>
-                <w:color w:val="FF0000"/>
-              </w:rPr>
-            </w:pPr>
-            <w:r>
-              <w:rPr>
-                <w:color w:val="FF0000"/>
-              </w:rPr>
-              <w:t>Công việc 3</w:t>
-            </w:r>
-          </w:p>
           <w:p>
             <w:pPr>
               <w:rPr>
@@ -2700,9 +2872,13 @@
         </w:tc>
       </w:tr>
       <w:tr>
+        <w:trPr>
+          <w:trHeight w:val="540"/>
+        </w:trPr>
         <w:tc>
           <w:tcPr>
             <w:tcW w:w="846" w:type="dxa"/>
+            <w:vMerge/>
           </w:tcPr>
           <w:p>
             <w:pPr>
@@ -2711,12 +2887,6 @@
                 <w:color w:val="FF0000"/>
               </w:rPr>
             </w:pPr>
-            <w:r>
-              <w:rPr>
-                <w:color w:val="FF0000"/>
-              </w:rPr>
-              <w:t>4</w:t>
-            </w:r>
           </w:p>
         </w:tc>
         <w:tc>
@@ -2729,64 +2899,6 @@
                 <w:color w:val="FF0000"/>
               </w:rPr>
             </w:pPr>
-            <w:r>
-              <w:rPr>
-                <w:color w:val="FF0000"/>
-              </w:rPr>
-              <w:t>A</w:t>
-            </w:r>
-          </w:p>
-          <w:p>
-            <w:pPr>
-              <w:rPr>
-                <w:color w:val="FF0000"/>
-              </w:rPr>
-            </w:pPr>
-            <w:r>
-              <w:rPr>
-                <w:color w:val="FF0000"/>
-              </w:rPr>
-              <w:t>B</w:t>
-            </w:r>
-          </w:p>
-          <w:p>
-            <w:pPr>
-              <w:rPr>
-                <w:color w:val="FF0000"/>
-              </w:rPr>
-            </w:pPr>
-            <w:r>
-              <w:rPr>
-                <w:color w:val="FF0000"/>
-              </w:rPr>
-              <w:t>C</w:t>
-            </w:r>
-          </w:p>
-          <w:p>
-            <w:pPr>
-              <w:rPr>
-                <w:color w:val="FF0000"/>
-              </w:rPr>
-            </w:pPr>
-            <w:r>
-              <w:rPr>
-                <w:color w:val="FF0000"/>
-              </w:rPr>
-              <w:t>D</w:t>
-            </w:r>
-          </w:p>
-          <w:p>
-            <w:pPr>
-              <w:rPr>
-                <w:color w:val="FF0000"/>
-              </w:rPr>
-            </w:pPr>
-            <w:r>
-              <w:rPr>
-                <w:color w:val="FF0000"/>
-              </w:rPr>
-              <w:t>E</w:t>
-            </w:r>
           </w:p>
         </w:tc>
         <w:tc>
@@ -2799,64 +2911,6 @@
                 <w:color w:val="FF0000"/>
               </w:rPr>
             </w:pPr>
-            <w:r>
-              <w:rPr>
-                <w:color w:val="FF0000"/>
-              </w:rPr>
-              <w:t>Công việc 1</w:t>
-            </w:r>
-          </w:p>
-          <w:p>
-            <w:pPr>
-              <w:rPr>
-                <w:color w:val="FF0000"/>
-              </w:rPr>
-            </w:pPr>
-            <w:r>
-              <w:rPr>
-                <w:color w:val="FF0000"/>
-              </w:rPr>
-              <w:t>Công việc 2</w:t>
-            </w:r>
-          </w:p>
-          <w:p>
-            <w:pPr>
-              <w:rPr>
-                <w:color w:val="FF0000"/>
-              </w:rPr>
-            </w:pPr>
-            <w:r>
-              <w:rPr>
-                <w:color w:val="FF0000"/>
-              </w:rPr>
-              <w:t>Công việc 3</w:t>
-            </w:r>
-          </w:p>
-          <w:p>
-            <w:pPr>
-              <w:rPr>
-                <w:color w:val="FF0000"/>
-              </w:rPr>
-            </w:pPr>
-            <w:r>
-              <w:rPr>
-                <w:color w:val="FF0000"/>
-              </w:rPr>
-              <w:t>Công việc 4</w:t>
-            </w:r>
-          </w:p>
-          <w:p>
-            <w:pPr>
-              <w:rPr>
-                <w:color w:val="FF0000"/>
-              </w:rPr>
-            </w:pPr>
-            <w:r>
-              <w:rPr>
-                <w:color w:val="FF0000"/>
-              </w:rPr>
-              <w:t>Công việc 5</w:t>
-            </w:r>
           </w:p>
         </w:tc>
         <w:tc>
@@ -2873,9 +2927,13 @@
         </w:tc>
       </w:tr>
       <w:tr>
+        <w:trPr>
+          <w:trHeight w:val="324"/>
+        </w:trPr>
         <w:tc>
           <w:tcPr>
             <w:tcW w:w="846" w:type="dxa"/>
+            <w:vMerge w:val="restart"/>
           </w:tcPr>
           <w:p>
             <w:pPr>
@@ -2888,6 +2946,948 @@
               <w:rPr>
                 <w:color w:val="FF0000"/>
               </w:rPr>
+              <w:t>2</w:t>
+            </w:r>
+          </w:p>
+        </w:tc>
+        <w:tc>
+          <w:tcPr>
+            <w:tcW w:w="2268" w:type="dxa"/>
+          </w:tcPr>
+          <w:p>
+            <w:pPr>
+              <w:rPr>
+                <w:color w:val="FF0000"/>
+              </w:rPr>
+            </w:pPr>
+            <w:r>
+              <w:rPr>
+                <w:color w:val="FF0000"/>
+              </w:rPr>
+              <w:t>A</w:t>
+            </w:r>
+          </w:p>
+          <w:p>
+            <w:pPr>
+              <w:rPr>
+                <w:color w:val="FF0000"/>
+              </w:rPr>
+            </w:pPr>
+            <w:r>
+              <w:rPr>
+                <w:color w:val="FF0000"/>
+              </w:rPr>
+              <w:t>B</w:t>
+            </w:r>
+          </w:p>
+        </w:tc>
+        <w:tc>
+          <w:tcPr>
+            <w:tcW w:w="5528" w:type="dxa"/>
+          </w:tcPr>
+          <w:p>
+            <w:pPr>
+              <w:rPr>
+                <w:color w:val="FF0000"/>
+              </w:rPr>
+            </w:pPr>
+            <w:r>
+              <w:rPr>
+                <w:color w:val="FF0000"/>
+              </w:rPr>
+              <w:t>Công việc 1</w:t>
+            </w:r>
+          </w:p>
+          <w:p>
+            <w:pPr>
+              <w:rPr>
+                <w:color w:val="FF0000"/>
+              </w:rPr>
+            </w:pPr>
+            <w:r>
+              <w:rPr>
+                <w:color w:val="FF0000"/>
+              </w:rPr>
+              <w:t>Công việc 2</w:t>
+            </w:r>
+          </w:p>
+        </w:tc>
+        <w:tc>
+          <w:tcPr>
+            <w:tcW w:w="4111" w:type="dxa"/>
+          </w:tcPr>
+          <w:p>
+            <w:pPr>
+              <w:rPr>
+                <w:color w:val="FF0000"/>
+              </w:rPr>
+            </w:pPr>
+          </w:p>
+        </w:tc>
+      </w:tr>
+      <w:tr>
+        <w:trPr>
+          <w:trHeight w:val="288"/>
+        </w:trPr>
+        <w:tc>
+          <w:tcPr>
+            <w:tcW w:w="846" w:type="dxa"/>
+            <w:vMerge/>
+          </w:tcPr>
+          <w:p>
+            <w:pPr>
+              <w:jc w:val="center"/>
+              <w:rPr>
+                <w:color w:val="FF0000"/>
+              </w:rPr>
+            </w:pPr>
+          </w:p>
+        </w:tc>
+        <w:tc>
+          <w:tcPr>
+            <w:tcW w:w="2268" w:type="dxa"/>
+          </w:tcPr>
+          <w:p>
+            <w:pPr>
+              <w:rPr>
+                <w:color w:val="FF0000"/>
+              </w:rPr>
+            </w:pPr>
+            <w:r>
+              <w:rPr>
+                <w:color w:val="FF0000"/>
+              </w:rPr>
+              <w:t>C</w:t>
+            </w:r>
+          </w:p>
+          <w:p>
+            <w:pPr>
+              <w:rPr>
+                <w:color w:val="FF0000"/>
+              </w:rPr>
+            </w:pPr>
+            <w:r>
+              <w:rPr>
+                <w:color w:val="FF0000"/>
+              </w:rPr>
+              <w:t>D</w:t>
+            </w:r>
+          </w:p>
+        </w:tc>
+        <w:tc>
+          <w:tcPr>
+            <w:tcW w:w="5528" w:type="dxa"/>
+          </w:tcPr>
+          <w:p>
+            <w:pPr>
+              <w:rPr>
+                <w:color w:val="FF0000"/>
+              </w:rPr>
+            </w:pPr>
+            <w:r>
+              <w:rPr>
+                <w:color w:val="FF0000"/>
+              </w:rPr>
+              <w:t>Công việc 3</w:t>
+            </w:r>
+          </w:p>
+          <w:p>
+            <w:pPr>
+              <w:rPr>
+                <w:color w:val="FF0000"/>
+              </w:rPr>
+            </w:pPr>
+            <w:r>
+              <w:rPr>
+                <w:color w:val="FF0000"/>
+              </w:rPr>
+              <w:t>Công việc 4</w:t>
+            </w:r>
+          </w:p>
+        </w:tc>
+        <w:tc>
+          <w:tcPr>
+            <w:tcW w:w="4111" w:type="dxa"/>
+          </w:tcPr>
+          <w:p>
+            <w:pPr>
+              <w:rPr>
+                <w:color w:val="FF0000"/>
+              </w:rPr>
+            </w:pPr>
+          </w:p>
+        </w:tc>
+      </w:tr>
+      <w:tr>
+        <w:trPr>
+          <w:trHeight w:val="444"/>
+        </w:trPr>
+        <w:tc>
+          <w:tcPr>
+            <w:tcW w:w="846" w:type="dxa"/>
+            <w:vMerge/>
+          </w:tcPr>
+          <w:p>
+            <w:pPr>
+              <w:jc w:val="center"/>
+              <w:rPr>
+                <w:color w:val="FF0000"/>
+              </w:rPr>
+            </w:pPr>
+          </w:p>
+        </w:tc>
+        <w:tc>
+          <w:tcPr>
+            <w:tcW w:w="2268" w:type="dxa"/>
+          </w:tcPr>
+          <w:p>
+            <w:pPr>
+              <w:rPr>
+                <w:color w:val="FF0000"/>
+              </w:rPr>
+            </w:pPr>
+            <w:r>
+              <w:rPr>
+                <w:color w:val="FF0000"/>
+              </w:rPr>
+              <w:t>E</w:t>
+            </w:r>
+          </w:p>
+        </w:tc>
+        <w:tc>
+          <w:tcPr>
+            <w:tcW w:w="5528" w:type="dxa"/>
+          </w:tcPr>
+          <w:p>
+            <w:pPr>
+              <w:rPr>
+                <w:color w:val="FF0000"/>
+              </w:rPr>
+            </w:pPr>
+            <w:r>
+              <w:rPr>
+                <w:color w:val="FF0000"/>
+              </w:rPr>
+              <w:t>Công việc 5</w:t>
+            </w:r>
+          </w:p>
+        </w:tc>
+        <w:tc>
+          <w:tcPr>
+            <w:tcW w:w="4111" w:type="dxa"/>
+          </w:tcPr>
+          <w:p>
+            <w:pPr>
+              <w:rPr>
+                <w:color w:val="FF0000"/>
+              </w:rPr>
+            </w:pPr>
+          </w:p>
+        </w:tc>
+      </w:tr>
+      <w:tr>
+        <w:trPr>
+          <w:trHeight w:val="408"/>
+        </w:trPr>
+        <w:tc>
+          <w:tcPr>
+            <w:tcW w:w="846" w:type="dxa"/>
+            <w:vMerge/>
+          </w:tcPr>
+          <w:p>
+            <w:pPr>
+              <w:jc w:val="center"/>
+              <w:rPr>
+                <w:color w:val="FF0000"/>
+              </w:rPr>
+            </w:pPr>
+          </w:p>
+        </w:tc>
+        <w:tc>
+          <w:tcPr>
+            <w:tcW w:w="2268" w:type="dxa"/>
+          </w:tcPr>
+          <w:p>
+            <w:pPr>
+              <w:rPr>
+                <w:color w:val="FF0000"/>
+              </w:rPr>
+            </w:pPr>
+          </w:p>
+        </w:tc>
+        <w:tc>
+          <w:tcPr>
+            <w:tcW w:w="5528" w:type="dxa"/>
+          </w:tcPr>
+          <w:p>
+            <w:pPr>
+              <w:rPr>
+                <w:color w:val="FF0000"/>
+              </w:rPr>
+            </w:pPr>
+          </w:p>
+        </w:tc>
+        <w:tc>
+          <w:tcPr>
+            <w:tcW w:w="4111" w:type="dxa"/>
+          </w:tcPr>
+          <w:p>
+            <w:pPr>
+              <w:rPr>
+                <w:color w:val="FF0000"/>
+              </w:rPr>
+            </w:pPr>
+          </w:p>
+        </w:tc>
+      </w:tr>
+      <w:tr>
+        <w:trPr>
+          <w:trHeight w:val="336"/>
+        </w:trPr>
+        <w:tc>
+          <w:tcPr>
+            <w:tcW w:w="846" w:type="dxa"/>
+            <w:vMerge w:val="restart"/>
+          </w:tcPr>
+          <w:p>
+            <w:pPr>
+              <w:jc w:val="center"/>
+              <w:rPr>
+                <w:color w:val="FF0000"/>
+              </w:rPr>
+            </w:pPr>
+            <w:r>
+              <w:rPr>
+                <w:color w:val="FF0000"/>
+              </w:rPr>
+              <w:t>3</w:t>
+            </w:r>
+          </w:p>
+        </w:tc>
+        <w:tc>
+          <w:tcPr>
+            <w:tcW w:w="2268" w:type="dxa"/>
+          </w:tcPr>
+          <w:p>
+            <w:pPr>
+              <w:rPr>
+                <w:color w:val="FF0000"/>
+              </w:rPr>
+            </w:pPr>
+            <w:r>
+              <w:rPr>
+                <w:color w:val="FF0000"/>
+              </w:rPr>
+              <w:t>A</w:t>
+            </w:r>
+          </w:p>
+          <w:p>
+            <w:pPr>
+              <w:rPr>
+                <w:color w:val="FF0000"/>
+              </w:rPr>
+            </w:pPr>
+            <w:r>
+              <w:rPr>
+                <w:color w:val="FF0000"/>
+              </w:rPr>
+              <w:t>B</w:t>
+            </w:r>
+          </w:p>
+        </w:tc>
+        <w:tc>
+          <w:tcPr>
+            <w:tcW w:w="5528" w:type="dxa"/>
+          </w:tcPr>
+          <w:p>
+            <w:pPr>
+              <w:rPr>
+                <w:color w:val="FF0000"/>
+              </w:rPr>
+            </w:pPr>
+            <w:r>
+              <w:rPr>
+                <w:color w:val="FF0000"/>
+              </w:rPr>
+              <w:t>Công việc 1</w:t>
+            </w:r>
+          </w:p>
+          <w:p>
+            <w:pPr>
+              <w:rPr>
+                <w:color w:val="FF0000"/>
+              </w:rPr>
+            </w:pPr>
+            <w:r>
+              <w:rPr>
+                <w:color w:val="FF0000"/>
+              </w:rPr>
+              <w:t>Công việc 2</w:t>
+            </w:r>
+          </w:p>
+        </w:tc>
+        <w:tc>
+          <w:tcPr>
+            <w:tcW w:w="4111" w:type="dxa"/>
+          </w:tcPr>
+          <w:p>
+            <w:pPr>
+              <w:rPr>
+                <w:color w:val="FF0000"/>
+              </w:rPr>
+            </w:pPr>
+          </w:p>
+        </w:tc>
+      </w:tr>
+      <w:tr>
+        <w:trPr>
+          <w:trHeight w:val="324"/>
+        </w:trPr>
+        <w:tc>
+          <w:tcPr>
+            <w:tcW w:w="846" w:type="dxa"/>
+            <w:vMerge/>
+          </w:tcPr>
+          <w:p>
+            <w:pPr>
+              <w:jc w:val="center"/>
+              <w:rPr>
+                <w:color w:val="FF0000"/>
+              </w:rPr>
+            </w:pPr>
+          </w:p>
+        </w:tc>
+        <w:tc>
+          <w:tcPr>
+            <w:tcW w:w="2268" w:type="dxa"/>
+          </w:tcPr>
+          <w:p>
+            <w:pPr>
+              <w:rPr>
+                <w:color w:val="FF0000"/>
+              </w:rPr>
+            </w:pPr>
+            <w:r>
+              <w:rPr>
+                <w:color w:val="FF0000"/>
+              </w:rPr>
+              <w:t>C</w:t>
+            </w:r>
+          </w:p>
+          <w:p>
+            <w:pPr>
+              <w:rPr>
+                <w:color w:val="FF0000"/>
+              </w:rPr>
+            </w:pPr>
+            <w:r>
+              <w:rPr>
+                <w:color w:val="FF0000"/>
+              </w:rPr>
+              <w:t>D</w:t>
+            </w:r>
+          </w:p>
+        </w:tc>
+        <w:tc>
+          <w:tcPr>
+            <w:tcW w:w="5528" w:type="dxa"/>
+          </w:tcPr>
+          <w:p>
+            <w:pPr>
+              <w:rPr>
+                <w:color w:val="FF0000"/>
+              </w:rPr>
+            </w:pPr>
+            <w:r>
+              <w:rPr>
+                <w:color w:val="FF0000"/>
+              </w:rPr>
+              <w:t>Công việc 3</w:t>
+            </w:r>
+          </w:p>
+          <w:p>
+            <w:pPr>
+              <w:rPr>
+                <w:color w:val="FF0000"/>
+              </w:rPr>
+            </w:pPr>
+            <w:r>
+              <w:rPr>
+                <w:color w:val="FF0000"/>
+              </w:rPr>
+              <w:t>Công việc 4</w:t>
+            </w:r>
+          </w:p>
+        </w:tc>
+        <w:tc>
+          <w:tcPr>
+            <w:tcW w:w="4111" w:type="dxa"/>
+          </w:tcPr>
+          <w:p>
+            <w:pPr>
+              <w:rPr>
+                <w:color w:val="FF0000"/>
+              </w:rPr>
+            </w:pPr>
+          </w:p>
+        </w:tc>
+      </w:tr>
+      <w:tr>
+        <w:trPr>
+          <w:trHeight w:val="492"/>
+        </w:trPr>
+        <w:tc>
+          <w:tcPr>
+            <w:tcW w:w="846" w:type="dxa"/>
+            <w:vMerge/>
+          </w:tcPr>
+          <w:p>
+            <w:pPr>
+              <w:jc w:val="center"/>
+              <w:rPr>
+                <w:color w:val="FF0000"/>
+              </w:rPr>
+            </w:pPr>
+          </w:p>
+        </w:tc>
+        <w:tc>
+          <w:tcPr>
+            <w:tcW w:w="2268" w:type="dxa"/>
+          </w:tcPr>
+          <w:p>
+            <w:pPr>
+              <w:rPr>
+                <w:color w:val="FF0000"/>
+              </w:rPr>
+            </w:pPr>
+            <w:r>
+              <w:rPr>
+                <w:color w:val="FF0000"/>
+              </w:rPr>
+              <w:t>E</w:t>
+            </w:r>
+          </w:p>
+        </w:tc>
+        <w:tc>
+          <w:tcPr>
+            <w:tcW w:w="5528" w:type="dxa"/>
+          </w:tcPr>
+          <w:p>
+            <w:pPr>
+              <w:rPr>
+                <w:color w:val="FF0000"/>
+              </w:rPr>
+            </w:pPr>
+            <w:r>
+              <w:rPr>
+                <w:color w:val="FF0000"/>
+              </w:rPr>
+              <w:t>Công việc 5</w:t>
+            </w:r>
+          </w:p>
+        </w:tc>
+        <w:tc>
+          <w:tcPr>
+            <w:tcW w:w="4111" w:type="dxa"/>
+          </w:tcPr>
+          <w:p>
+            <w:pPr>
+              <w:rPr>
+                <w:color w:val="FF0000"/>
+              </w:rPr>
+            </w:pPr>
+          </w:p>
+        </w:tc>
+      </w:tr>
+      <w:tr>
+        <w:trPr>
+          <w:trHeight w:val="312"/>
+        </w:trPr>
+        <w:tc>
+          <w:tcPr>
+            <w:tcW w:w="846" w:type="dxa"/>
+            <w:vMerge/>
+          </w:tcPr>
+          <w:p>
+            <w:pPr>
+              <w:jc w:val="center"/>
+              <w:rPr>
+                <w:color w:val="FF0000"/>
+              </w:rPr>
+            </w:pPr>
+          </w:p>
+        </w:tc>
+        <w:tc>
+          <w:tcPr>
+            <w:tcW w:w="2268" w:type="dxa"/>
+          </w:tcPr>
+          <w:p>
+            <w:pPr>
+              <w:rPr>
+                <w:color w:val="FF0000"/>
+              </w:rPr>
+            </w:pPr>
+          </w:p>
+        </w:tc>
+        <w:tc>
+          <w:tcPr>
+            <w:tcW w:w="5528" w:type="dxa"/>
+          </w:tcPr>
+          <w:p>
+            <w:pPr>
+              <w:rPr>
+                <w:color w:val="FF0000"/>
+              </w:rPr>
+            </w:pPr>
+          </w:p>
+        </w:tc>
+        <w:tc>
+          <w:tcPr>
+            <w:tcW w:w="4111" w:type="dxa"/>
+          </w:tcPr>
+          <w:p>
+            <w:pPr>
+              <w:rPr>
+                <w:color w:val="FF0000"/>
+              </w:rPr>
+            </w:pPr>
+          </w:p>
+        </w:tc>
+      </w:tr>
+      <w:tr>
+        <w:trPr>
+          <w:trHeight w:val="300"/>
+        </w:trPr>
+        <w:tc>
+          <w:tcPr>
+            <w:tcW w:w="846" w:type="dxa"/>
+            <w:vMerge w:val="restart"/>
+          </w:tcPr>
+          <w:p>
+            <w:pPr>
+              <w:jc w:val="center"/>
+              <w:rPr>
+                <w:color w:val="FF0000"/>
+              </w:rPr>
+            </w:pPr>
+            <w:r>
+              <w:rPr>
+                <w:color w:val="FF0000"/>
+              </w:rPr>
+              <w:t>4</w:t>
+            </w:r>
+          </w:p>
+        </w:tc>
+        <w:tc>
+          <w:tcPr>
+            <w:tcW w:w="2268" w:type="dxa"/>
+          </w:tcPr>
+          <w:p>
+            <w:pPr>
+              <w:rPr>
+                <w:color w:val="FF0000"/>
+              </w:rPr>
+            </w:pPr>
+            <w:r>
+              <w:rPr>
+                <w:color w:val="FF0000"/>
+              </w:rPr>
+              <w:t>A</w:t>
+            </w:r>
+          </w:p>
+          <w:p>
+            <w:pPr>
+              <w:rPr>
+                <w:color w:val="FF0000"/>
+              </w:rPr>
+            </w:pPr>
+            <w:r>
+              <w:rPr>
+                <w:color w:val="FF0000"/>
+              </w:rPr>
+              <w:t>B</w:t>
+            </w:r>
+          </w:p>
+        </w:tc>
+        <w:tc>
+          <w:tcPr>
+            <w:tcW w:w="5528" w:type="dxa"/>
+          </w:tcPr>
+          <w:p>
+            <w:pPr>
+              <w:rPr>
+                <w:color w:val="FF0000"/>
+              </w:rPr>
+            </w:pPr>
+            <w:r>
+              <w:rPr>
+                <w:color w:val="FF0000"/>
+              </w:rPr>
+              <w:t>Công việc 1</w:t>
+            </w:r>
+          </w:p>
+          <w:p>
+            <w:pPr>
+              <w:rPr>
+                <w:color w:val="FF0000"/>
+              </w:rPr>
+            </w:pPr>
+            <w:r>
+              <w:rPr>
+                <w:color w:val="FF0000"/>
+              </w:rPr>
+              <w:t>Công việc 2</w:t>
+            </w:r>
+          </w:p>
+        </w:tc>
+        <w:tc>
+          <w:tcPr>
+            <w:tcW w:w="4111" w:type="dxa"/>
+          </w:tcPr>
+          <w:p>
+            <w:pPr>
+              <w:rPr>
+                <w:color w:val="FF0000"/>
+              </w:rPr>
+            </w:pPr>
+          </w:p>
+        </w:tc>
+      </w:tr>
+      <w:tr>
+        <w:trPr>
+          <w:trHeight w:val="309"/>
+        </w:trPr>
+        <w:tc>
+          <w:tcPr>
+            <w:tcW w:w="846" w:type="dxa"/>
+            <w:vMerge/>
+          </w:tcPr>
+          <w:p>
+            <w:pPr>
+              <w:jc w:val="center"/>
+              <w:rPr>
+                <w:color w:val="FF0000"/>
+              </w:rPr>
+            </w:pPr>
+          </w:p>
+        </w:tc>
+        <w:tc>
+          <w:tcPr>
+            <w:tcW w:w="2268" w:type="dxa"/>
+          </w:tcPr>
+          <w:p>
+            <w:pPr>
+              <w:rPr>
+                <w:color w:val="FF0000"/>
+              </w:rPr>
+            </w:pPr>
+            <w:r>
+              <w:rPr>
+                <w:color w:val="FF0000"/>
+              </w:rPr>
+              <w:t>C</w:t>
+            </w:r>
+          </w:p>
+          <w:p>
+            <w:pPr>
+              <w:rPr>
+                <w:color w:val="FF0000"/>
+              </w:rPr>
+            </w:pPr>
+            <w:r>
+              <w:rPr>
+                <w:color w:val="FF0000"/>
+              </w:rPr>
+              <w:t>D</w:t>
+            </w:r>
+          </w:p>
+        </w:tc>
+        <w:tc>
+          <w:tcPr>
+            <w:tcW w:w="5528" w:type="dxa"/>
+          </w:tcPr>
+          <w:p>
+            <w:pPr>
+              <w:rPr>
+                <w:color w:val="FF0000"/>
+              </w:rPr>
+            </w:pPr>
+            <w:r>
+              <w:rPr>
+                <w:color w:val="FF0000"/>
+              </w:rPr>
+              <w:t>Công việc 3</w:t>
+            </w:r>
+          </w:p>
+          <w:p>
+            <w:pPr>
+              <w:rPr>
+                <w:color w:val="FF0000"/>
+              </w:rPr>
+            </w:pPr>
+            <w:r>
+              <w:rPr>
+                <w:color w:val="FF0000"/>
+              </w:rPr>
+              <w:t>Công việc 4</w:t>
+            </w:r>
+          </w:p>
+        </w:tc>
+        <w:tc>
+          <w:tcPr>
+            <w:tcW w:w="4111" w:type="dxa"/>
+          </w:tcPr>
+          <w:p>
+            <w:pPr>
+              <w:rPr>
+                <w:color w:val="FF0000"/>
+              </w:rPr>
+            </w:pPr>
+          </w:p>
+        </w:tc>
+      </w:tr>
+      <w:tr>
+        <w:trPr>
+          <w:trHeight w:val="336"/>
+        </w:trPr>
+        <w:tc>
+          <w:tcPr>
+            <w:tcW w:w="846" w:type="dxa"/>
+            <w:vMerge/>
+          </w:tcPr>
+          <w:p>
+            <w:pPr>
+              <w:jc w:val="center"/>
+              <w:rPr>
+                <w:color w:val="FF0000"/>
+              </w:rPr>
+            </w:pPr>
+          </w:p>
+        </w:tc>
+        <w:tc>
+          <w:tcPr>
+            <w:tcW w:w="2268" w:type="dxa"/>
+          </w:tcPr>
+          <w:p>
+            <w:pPr>
+              <w:rPr>
+                <w:color w:val="FF0000"/>
+              </w:rPr>
+            </w:pPr>
+            <w:r>
+              <w:rPr>
+                <w:color w:val="FF0000"/>
+              </w:rPr>
+              <w:t>E</w:t>
+            </w:r>
+          </w:p>
+        </w:tc>
+        <w:tc>
+          <w:tcPr>
+            <w:tcW w:w="5528" w:type="dxa"/>
+          </w:tcPr>
+          <w:p>
+            <w:pPr>
+              <w:rPr>
+                <w:color w:val="FF0000"/>
+              </w:rPr>
+            </w:pPr>
+            <w:r>
+              <w:rPr>
+                <w:color w:val="FF0000"/>
+              </w:rPr>
+              <w:t>Công việc 5</w:t>
+            </w:r>
+          </w:p>
+        </w:tc>
+        <w:tc>
+          <w:tcPr>
+            <w:tcW w:w="4111" w:type="dxa"/>
+          </w:tcPr>
+          <w:p>
+            <w:pPr>
+              <w:rPr>
+                <w:color w:val="FF0000"/>
+              </w:rPr>
+            </w:pPr>
+          </w:p>
+        </w:tc>
+      </w:tr>
+      <w:tr>
+        <w:trPr>
+          <w:trHeight w:val="228"/>
+        </w:trPr>
+        <w:tc>
+          <w:tcPr>
+            <w:tcW w:w="846" w:type="dxa"/>
+            <w:vMerge/>
+          </w:tcPr>
+          <w:p>
+            <w:pPr>
+              <w:jc w:val="center"/>
+              <w:rPr>
+                <w:color w:val="FF0000"/>
+              </w:rPr>
+            </w:pPr>
+          </w:p>
+        </w:tc>
+        <w:tc>
+          <w:tcPr>
+            <w:tcW w:w="2268" w:type="dxa"/>
+          </w:tcPr>
+          <w:p>
+            <w:pPr>
+              <w:rPr>
+                <w:color w:val="FF0000"/>
+              </w:rPr>
+            </w:pPr>
+          </w:p>
+        </w:tc>
+        <w:tc>
+          <w:tcPr>
+            <w:tcW w:w="5528" w:type="dxa"/>
+          </w:tcPr>
+          <w:p>
+            <w:pPr>
+              <w:rPr>
+                <w:color w:val="FF0000"/>
+              </w:rPr>
+            </w:pPr>
+          </w:p>
+        </w:tc>
+        <w:tc>
+          <w:tcPr>
+            <w:tcW w:w="4111" w:type="dxa"/>
+          </w:tcPr>
+          <w:p>
+            <w:pPr>
+              <w:rPr>
+                <w:color w:val="FF0000"/>
+              </w:rPr>
+            </w:pPr>
+          </w:p>
+        </w:tc>
+      </w:tr>
+      <w:tr>
+        <w:trPr>
+          <w:trHeight w:val="324"/>
+        </w:trPr>
+        <w:tc>
+          <w:tcPr>
+            <w:tcW w:w="846" w:type="dxa"/>
+            <w:vMerge w:val="restart"/>
+          </w:tcPr>
+          <w:p>
+            <w:pPr>
+              <w:jc w:val="center"/>
+              <w:rPr>
+                <w:color w:val="FF0000"/>
+              </w:rPr>
+            </w:pPr>
+            <w:r>
+              <w:rPr>
+                <w:color w:val="FF0000"/>
+              </w:rPr>
               <w:t>5</w:t>
             </w:r>
           </w:p>
@@ -2922,6 +3922,73 @@
               <w:t>B</w:t>
             </w:r>
           </w:p>
+        </w:tc>
+        <w:tc>
+          <w:tcPr>
+            <w:tcW w:w="5528" w:type="dxa"/>
+          </w:tcPr>
+          <w:p>
+            <w:pPr>
+              <w:rPr>
+                <w:color w:val="FF0000"/>
+              </w:rPr>
+            </w:pPr>
+            <w:r>
+              <w:rPr>
+                <w:color w:val="FF0000"/>
+              </w:rPr>
+              <w:t>Công việc 1</w:t>
+            </w:r>
+          </w:p>
+          <w:p>
+            <w:pPr>
+              <w:rPr>
+                <w:color w:val="FF0000"/>
+              </w:rPr>
+            </w:pPr>
+            <w:r>
+              <w:rPr>
+                <w:color w:val="FF0000"/>
+              </w:rPr>
+              <w:t>Công việc 2</w:t>
+            </w:r>
+          </w:p>
+        </w:tc>
+        <w:tc>
+          <w:tcPr>
+            <w:tcW w:w="4111" w:type="dxa"/>
+          </w:tcPr>
+          <w:p>
+            <w:pPr>
+              <w:rPr>
+                <w:color w:val="FF0000"/>
+              </w:rPr>
+            </w:pPr>
+          </w:p>
+        </w:tc>
+      </w:tr>
+      <w:tr>
+        <w:trPr>
+          <w:trHeight w:val="300"/>
+        </w:trPr>
+        <w:tc>
+          <w:tcPr>
+            <w:tcW w:w="846" w:type="dxa"/>
+            <w:vMerge/>
+          </w:tcPr>
+          <w:p>
+            <w:pPr>
+              <w:jc w:val="center"/>
+              <w:rPr>
+                <w:color w:val="FF0000"/>
+              </w:rPr>
+            </w:pPr>
+          </w:p>
+        </w:tc>
+        <w:tc>
+          <w:tcPr>
+            <w:tcW w:w="2268" w:type="dxa"/>
+          </w:tcPr>
           <w:p>
             <w:pPr>
               <w:rPr>
@@ -2945,10 +4012,76 @@
               <w:rPr>
                 <w:color w:val="FF0000"/>
               </w:rPr>
-              <w:lastRenderedPageBreak/>
               <w:t>D</w:t>
             </w:r>
           </w:p>
+        </w:tc>
+        <w:tc>
+          <w:tcPr>
+            <w:tcW w:w="5528" w:type="dxa"/>
+          </w:tcPr>
+          <w:p>
+            <w:pPr>
+              <w:rPr>
+                <w:color w:val="FF0000"/>
+              </w:rPr>
+            </w:pPr>
+            <w:r>
+              <w:rPr>
+                <w:color w:val="FF0000"/>
+              </w:rPr>
+              <w:t>Công việc 3</w:t>
+            </w:r>
+          </w:p>
+          <w:p>
+            <w:pPr>
+              <w:rPr>
+                <w:color w:val="FF0000"/>
+              </w:rPr>
+            </w:pPr>
+            <w:r>
+              <w:rPr>
+                <w:color w:val="FF0000"/>
+              </w:rPr>
+              <w:t>Công việc 4</w:t>
+            </w:r>
+          </w:p>
+        </w:tc>
+        <w:tc>
+          <w:tcPr>
+            <w:tcW w:w="4111" w:type="dxa"/>
+          </w:tcPr>
+          <w:p>
+            <w:pPr>
+              <w:rPr>
+                <w:color w:val="FF0000"/>
+              </w:rPr>
+            </w:pPr>
+          </w:p>
+        </w:tc>
+      </w:tr>
+      <w:tr>
+        <w:trPr>
+          <w:trHeight w:val="492"/>
+        </w:trPr>
+        <w:tc>
+          <w:tcPr>
+            <w:tcW w:w="846" w:type="dxa"/>
+            <w:vMerge/>
+          </w:tcPr>
+          <w:p>
+            <w:pPr>
+              <w:jc w:val="center"/>
+              <w:rPr>
+                <w:color w:val="FF0000"/>
+              </w:rPr>
+            </w:pPr>
+          </w:p>
+        </w:tc>
+        <w:tc>
+          <w:tcPr>
+            <w:tcW w:w="2268" w:type="dxa"/>
+          </w:tcPr>
           <w:p>
             <w:pPr>
               <w:rPr>
@@ -2977,62 +4110,63 @@
               <w:rPr>
                 <w:color w:val="FF0000"/>
               </w:rPr>
-              <w:lastRenderedPageBreak/>
-              <w:t>Công việc 1</w:t>
-            </w:r>
-          </w:p>
-          <w:p>
-            <w:pPr>
-              <w:rPr>
-                <w:color w:val="FF0000"/>
-              </w:rPr>
-            </w:pPr>
-            <w:r>
-              <w:rPr>
-                <w:color w:val="FF0000"/>
-              </w:rPr>
-              <w:t>Công việc 2</w:t>
-            </w:r>
-          </w:p>
-          <w:p>
-            <w:pPr>
-              <w:rPr>
-                <w:color w:val="FF0000"/>
-              </w:rPr>
-            </w:pPr>
-            <w:r>
-              <w:rPr>
-                <w:color w:val="FF0000"/>
-              </w:rPr>
-              <w:t>Công việc 3</w:t>
-            </w:r>
-          </w:p>
-          <w:p>
-            <w:pPr>
-              <w:rPr>
-                <w:color w:val="FF0000"/>
-              </w:rPr>
-            </w:pPr>
-            <w:r>
-              <w:rPr>
-                <w:color w:val="FF0000"/>
-              </w:rPr>
-              <w:lastRenderedPageBreak/>
-              <w:t>Công việc 4</w:t>
-            </w:r>
-          </w:p>
-          <w:p>
-            <w:pPr>
-              <w:rPr>
-                <w:color w:val="FF0000"/>
-              </w:rPr>
-            </w:pPr>
-            <w:r>
-              <w:rPr>
-                <w:color w:val="FF0000"/>
-              </w:rPr>
               <w:t>Công việc 5</w:t>
             </w:r>
+          </w:p>
+        </w:tc>
+        <w:tc>
+          <w:tcPr>
+            <w:tcW w:w="4111" w:type="dxa"/>
+          </w:tcPr>
+          <w:p>
+            <w:pPr>
+              <w:rPr>
+                <w:color w:val="FF0000"/>
+              </w:rPr>
+            </w:pPr>
+          </w:p>
+        </w:tc>
+      </w:tr>
+      <w:tr>
+        <w:trPr>
+          <w:trHeight w:val="348"/>
+        </w:trPr>
+        <w:tc>
+          <w:tcPr>
+            <w:tcW w:w="846" w:type="dxa"/>
+            <w:vMerge/>
+          </w:tcPr>
+          <w:p>
+            <w:pPr>
+              <w:jc w:val="center"/>
+              <w:rPr>
+                <w:color w:val="FF0000"/>
+              </w:rPr>
+            </w:pPr>
+          </w:p>
+        </w:tc>
+        <w:tc>
+          <w:tcPr>
+            <w:tcW w:w="2268" w:type="dxa"/>
+          </w:tcPr>
+          <w:p>
+            <w:pPr>
+              <w:rPr>
+                <w:color w:val="FF0000"/>
+              </w:rPr>
+            </w:pPr>
+          </w:p>
+        </w:tc>
+        <w:tc>
+          <w:tcPr>
+            <w:tcW w:w="5528" w:type="dxa"/>
+          </w:tcPr>
+          <w:p>
+            <w:pPr>
+              <w:rPr>
+                <w:color w:val="FF0000"/>
+              </w:rPr>
+            </w:pPr>
           </w:p>
         </w:tc>
         <w:tc>
@@ -4280,6 +5414,7 @@
   <w:style w:type="paragraph" w:default="1" w:styleId="Normal">
     <w:name w:val="Normal"/>
     <w:qFormat/>
+    <w:rsid w:val="00895982"/>
   </w:style>
   <w:style w:type="character" w:default="1" w:styleId="DefaultParagraphFont">
     <w:name w:val="Default Paragraph Font"/>

</xml_diff>